<commit_message>
ajoute du module bank
</commit_message>
<xml_diff>
--- a/facture-remplie.docx
+++ b/facture-remplie.docx
@@ -72,24 +72,6 @@
         <w:spacing w:after="240"/>
         <w:jc w:val="right"/>
       </w:pPr>
-      <w:r>
-        <w:rPr>
-          <w:b/>
-          <w:bCs/>
-          <w:color w:val="333333"/>
-          <w:sz w:val="18"/>
-          <w:szCs w:val="18"/>
-        </w:rPr>
-        <w:t xml:space="preserve">Échéance : </w:t>
-      </w:r>
-      <w:r>
-        <w:rPr>
-          <w:color w:val="333333"/>
-          <w:sz w:val="18"/>
-          <w:szCs w:val="18"/>
-        </w:rPr>
-        <w:t>22/04/2026</w:t>
-      </w:r>
     </w:p>
     <w:tbl>
       <w:tblPr>
@@ -3269,380 +3251,6 @@
           </w:p>
         </w:tc>
       </w:tr>
-      <w:tr>
-        <w:trPr>
-          <w:cantSplit/>
-        </w:trPr>
-        <w:tc>
-          <w:tcPr>
-            <w:tcW w:w="1400" w:type="dxa"/>
-            <w:tcBorders>
-              <w:top w:val="single" w:sz="1" w:space="0" w:color="D4D4D4"/>
-              <w:left w:val="single" w:sz="1" w:space="0" w:color="D4D4D4"/>
-              <w:bottom w:val="single" w:sz="1" w:space="0" w:color="D4D4D4"/>
-              <w:right w:val="single" w:sz="1" w:space="0" w:color="D4D4D4"/>
-            </w:tcBorders>
-            <w:tcMar>
-              <w:top w:w="60" w:type="dxa"/>
-              <w:left w:w="100" w:type="dxa"/>
-              <w:bottom w:w="60" w:type="dxa"/>
-              <w:right w:w="100" w:type="dxa"/>
-            </w:tcMar>
-            <w:vAlign w:val="center"/>
-          </w:tcPr>
-          <w:p>
-            <w:pPr>
-              <w:rPr>
-                <w:color w:val="333333"/>
-                <w:sz w:val="18"/>
-                <w:szCs w:val="18"/>
-              </w:rPr>
-            </w:pPr>
-            <w:r>
-              <w:rPr>
-                <w:color w:val="333333"/>
-                <w:sz w:val="18"/>
-                <w:szCs w:val="18"/>
-              </w:rPr>
-              <w:t>SVC-FORMSYS</w:t>
-            </w:r>
-          </w:p>
-        </w:tc>
-        <w:tc>
-          <w:tcPr>
-            <w:tcW w:w="4226" w:type="dxa"/>
-            <w:tcBorders>
-              <w:top w:val="single" w:sz="1" w:space="0" w:color="D4D4D4"/>
-              <w:left w:val="single" w:sz="1" w:space="0" w:color="D4D4D4"/>
-              <w:bottom w:val="single" w:sz="1" w:space="0" w:color="D4D4D4"/>
-              <w:right w:val="single" w:sz="1" w:space="0" w:color="D4D4D4"/>
-            </w:tcBorders>
-            <w:tcMar>
-              <w:top w:w="60" w:type="dxa"/>
-              <w:left w:w="100" w:type="dxa"/>
-              <w:bottom w:w="60" w:type="dxa"/>
-              <w:right w:w="100" w:type="dxa"/>
-            </w:tcMar>
-            <w:vAlign w:val="center"/>
-          </w:tcPr>
-          <w:p>
-            <w:pPr>
-              <w:rPr>
-                <w:color w:val="333333"/>
-                <w:sz w:val="18"/>
-                <w:szCs w:val="18"/>
-              </w:rPr>
-            </w:pPr>
-            <w:r>
-              <w:rPr>
-                <w:color w:val="333333"/>
-                <w:sz w:val="18"/>
-                <w:szCs w:val="18"/>
-              </w:rPr>
-              <w:t>Formation sur site — administration Windows Server / Linux, virtualisation Hyper-V ou VMware</w:t>
-            </w:r>
-          </w:p>
-        </w:tc>
-        <w:tc>
-          <w:tcPr>
-            <w:tcW w:w="1100" w:type="dxa"/>
-            <w:tcBorders>
-              <w:top w:val="single" w:sz="1" w:space="0" w:color="D4D4D4"/>
-              <w:left w:val="single" w:sz="1" w:space="0" w:color="D4D4D4"/>
-              <w:bottom w:val="single" w:sz="1" w:space="0" w:color="D4D4D4"/>
-              <w:right w:val="single" w:sz="1" w:space="0" w:color="D4D4D4"/>
-            </w:tcBorders>
-            <w:tcMar>
-              <w:top w:w="60" w:type="dxa"/>
-              <w:left w:w="100" w:type="dxa"/>
-              <w:bottom w:w="60" w:type="dxa"/>
-              <w:right w:w="100" w:type="dxa"/>
-            </w:tcMar>
-            <w:vAlign w:val="center"/>
-          </w:tcPr>
-          <w:p>
-            <w:pPr>
-              <w:jc w:val="right"/>
-              <w:rPr>
-                <w:color w:val="333333"/>
-                <w:sz w:val="18"/>
-                <w:szCs w:val="18"/>
-              </w:rPr>
-            </w:pPr>
-            <w:r>
-              <w:rPr>
-                <w:color w:val="333333"/>
-                <w:sz w:val="18"/>
-                <w:szCs w:val="18"/>
-              </w:rPr>
-              <w:t>150 000</w:t>
-            </w:r>
-          </w:p>
-        </w:tc>
-        <w:tc>
-          <w:tcPr>
-            <w:tcW w:w="1300" w:type="dxa"/>
-            <w:tcBorders>
-              <w:top w:val="single" w:sz="1" w:space="0" w:color="D4D4D4"/>
-              <w:left w:val="single" w:sz="1" w:space="0" w:color="D4D4D4"/>
-              <w:bottom w:val="single" w:sz="1" w:space="0" w:color="D4D4D4"/>
-              <w:right w:val="single" w:sz="1" w:space="0" w:color="D4D4D4"/>
-            </w:tcBorders>
-            <w:tcMar>
-              <w:top w:w="60" w:type="dxa"/>
-              <w:left w:w="100" w:type="dxa"/>
-              <w:bottom w:w="60" w:type="dxa"/>
-              <w:right w:w="100" w:type="dxa"/>
-            </w:tcMar>
-            <w:vAlign w:val="center"/>
-          </w:tcPr>
-          <w:p>
-            <w:pPr>
-              <w:jc w:val="center"/>
-              <w:rPr>
-                <w:color w:val="333333"/>
-                <w:sz w:val="18"/>
-                <w:szCs w:val="18"/>
-              </w:rPr>
-            </w:pPr>
-            <w:r>
-              <w:rPr>
-                <w:color w:val="333333"/>
-                <w:sz w:val="18"/>
-                <w:szCs w:val="18"/>
-              </w:rPr>
-              <w:t>1 jour</w:t>
-            </w:r>
-          </w:p>
-        </w:tc>
-        <w:tc>
-          <w:tcPr>
-            <w:tcW w:w="1000" w:type="dxa"/>
-            <w:tcBorders>
-              <w:top w:val="single" w:sz="1" w:space="0" w:color="D4D4D4"/>
-              <w:left w:val="single" w:sz="1" w:space="0" w:color="D4D4D4"/>
-              <w:bottom w:val="single" w:sz="1" w:space="0" w:color="D4D4D4"/>
-              <w:right w:val="single" w:sz="1" w:space="0" w:color="D4D4D4"/>
-            </w:tcBorders>
-            <w:tcMar>
-              <w:top w:w="60" w:type="dxa"/>
-              <w:left w:w="100" w:type="dxa"/>
-              <w:bottom w:w="60" w:type="dxa"/>
-              <w:right w:w="100" w:type="dxa"/>
-            </w:tcMar>
-            <w:vAlign w:val="center"/>
-          </w:tcPr>
-          <w:p>
-            <w:pPr>
-              <w:jc w:val="right"/>
-              <w:rPr>
-                <w:b/>
-                <w:bCs/>
-                <w:color w:val="333333"/>
-                <w:sz w:val="18"/>
-                <w:szCs w:val="18"/>
-              </w:rPr>
-            </w:pPr>
-            <w:r>
-              <w:rPr>
-                <w:b/>
-                <w:bCs/>
-                <w:color w:val="333333"/>
-                <w:sz w:val="18"/>
-                <w:szCs w:val="18"/>
-              </w:rPr>
-              <w:t>150 000</w:t>
-            </w:r>
-          </w:p>
-        </w:tc>
-      </w:tr>
-      <w:tr>
-        <w:trPr>
-          <w:cantSplit/>
-        </w:trPr>
-        <w:tc>
-          <w:tcPr>
-            <w:tcW w:w="1400" w:type="dxa"/>
-            <w:tcBorders>
-              <w:top w:val="single" w:sz="1" w:space="0" w:color="D4D4D4"/>
-              <w:left w:val="single" w:sz="1" w:space="0" w:color="D4D4D4"/>
-              <w:bottom w:val="single" w:sz="1" w:space="0" w:color="D4D4D4"/>
-              <w:right w:val="single" w:sz="1" w:space="0" w:color="D4D4D4"/>
-            </w:tcBorders>
-            <w:tcMar>
-              <w:top w:w="60" w:type="dxa"/>
-              <w:left w:w="100" w:type="dxa"/>
-              <w:bottom w:w="60" w:type="dxa"/>
-              <w:right w:w="100" w:type="dxa"/>
-            </w:tcMar>
-            <w:vAlign w:val="center"/>
-          </w:tcPr>
-          <w:p>
-            <w:pPr>
-              <w:rPr>
-                <w:color w:val="333333"/>
-                <w:sz w:val="18"/>
-                <w:szCs w:val="18"/>
-              </w:rPr>
-            </w:pPr>
-            <w:r>
-              <w:rPr>
-                <w:color w:val="333333"/>
-                <w:sz w:val="18"/>
-                <w:szCs w:val="18"/>
-              </w:rPr>
-              <w:t>SVC-FORMSYS</w:t>
-            </w:r>
-          </w:p>
-        </w:tc>
-        <w:tc>
-          <w:tcPr>
-            <w:tcW w:w="4226" w:type="dxa"/>
-            <w:tcBorders>
-              <w:top w:val="single" w:sz="1" w:space="0" w:color="D4D4D4"/>
-              <w:left w:val="single" w:sz="1" w:space="0" w:color="D4D4D4"/>
-              <w:bottom w:val="single" w:sz="1" w:space="0" w:color="D4D4D4"/>
-              <w:right w:val="single" w:sz="1" w:space="0" w:color="D4D4D4"/>
-            </w:tcBorders>
-            <w:tcMar>
-              <w:top w:w="60" w:type="dxa"/>
-              <w:left w:w="100" w:type="dxa"/>
-              <w:bottom w:w="60" w:type="dxa"/>
-              <w:right w:w="100" w:type="dxa"/>
-            </w:tcMar>
-            <w:vAlign w:val="center"/>
-          </w:tcPr>
-          <w:p>
-            <w:pPr>
-              <w:rPr>
-                <w:color w:val="333333"/>
-                <w:sz w:val="18"/>
-                <w:szCs w:val="18"/>
-              </w:rPr>
-            </w:pPr>
-            <w:r>
-              <w:rPr>
-                <w:color w:val="333333"/>
-                <w:sz w:val="18"/>
-                <w:szCs w:val="18"/>
-              </w:rPr>
-              <w:t>Formation sur site — administration Windows Server / Linux, virtualisation Hyper-V ou VMware</w:t>
-            </w:r>
-          </w:p>
-        </w:tc>
-        <w:tc>
-          <w:tcPr>
-            <w:tcW w:w="1100" w:type="dxa"/>
-            <w:tcBorders>
-              <w:top w:val="single" w:sz="1" w:space="0" w:color="D4D4D4"/>
-              <w:left w:val="single" w:sz="1" w:space="0" w:color="D4D4D4"/>
-              <w:bottom w:val="single" w:sz="1" w:space="0" w:color="D4D4D4"/>
-              <w:right w:val="single" w:sz="1" w:space="0" w:color="D4D4D4"/>
-            </w:tcBorders>
-            <w:tcMar>
-              <w:top w:w="60" w:type="dxa"/>
-              <w:left w:w="100" w:type="dxa"/>
-              <w:bottom w:w="60" w:type="dxa"/>
-              <w:right w:w="100" w:type="dxa"/>
-            </w:tcMar>
-            <w:vAlign w:val="center"/>
-          </w:tcPr>
-          <w:p>
-            <w:pPr>
-              <w:jc w:val="right"/>
-              <w:rPr>
-                <w:color w:val="333333"/>
-                <w:sz w:val="18"/>
-                <w:szCs w:val="18"/>
-              </w:rPr>
-            </w:pPr>
-            <w:r>
-              <w:rPr>
-                <w:color w:val="333333"/>
-                <w:sz w:val="18"/>
-                <w:szCs w:val="18"/>
-              </w:rPr>
-              <w:t>150 000</w:t>
-            </w:r>
-          </w:p>
-        </w:tc>
-        <w:tc>
-          <w:tcPr>
-            <w:tcW w:w="1300" w:type="dxa"/>
-            <w:tcBorders>
-              <w:top w:val="single" w:sz="1" w:space="0" w:color="D4D4D4"/>
-              <w:left w:val="single" w:sz="1" w:space="0" w:color="D4D4D4"/>
-              <w:bottom w:val="single" w:sz="1" w:space="0" w:color="D4D4D4"/>
-              <w:right w:val="single" w:sz="1" w:space="0" w:color="D4D4D4"/>
-            </w:tcBorders>
-            <w:tcMar>
-              <w:top w:w="60" w:type="dxa"/>
-              <w:left w:w="100" w:type="dxa"/>
-              <w:bottom w:w="60" w:type="dxa"/>
-              <w:right w:w="100" w:type="dxa"/>
-            </w:tcMar>
-            <w:vAlign w:val="center"/>
-          </w:tcPr>
-          <w:p>
-            <w:pPr>
-              <w:jc w:val="center"/>
-              <w:rPr>
-                <w:color w:val="333333"/>
-                <w:sz w:val="18"/>
-                <w:szCs w:val="18"/>
-              </w:rPr>
-            </w:pPr>
-            <w:r>
-              <w:rPr>
-                <w:color w:val="333333"/>
-                <w:sz w:val="18"/>
-                <w:szCs w:val="18"/>
-              </w:rPr>
-              <w:t>1 jour</w:t>
-            </w:r>
-          </w:p>
-        </w:tc>
-        <w:tc>
-          <w:tcPr>
-            <w:tcW w:w="1000" w:type="dxa"/>
-            <w:tcBorders>
-              <w:top w:val="single" w:sz="1" w:space="0" w:color="D4D4D4"/>
-              <w:left w:val="single" w:sz="1" w:space="0" w:color="D4D4D4"/>
-              <w:bottom w:val="single" w:sz="1" w:space="0" w:color="D4D4D4"/>
-              <w:right w:val="single" w:sz="1" w:space="0" w:color="D4D4D4"/>
-            </w:tcBorders>
-            <w:tcMar>
-              <w:top w:w="60" w:type="dxa"/>
-              <w:left w:w="100" w:type="dxa"/>
-              <w:bottom w:w="60" w:type="dxa"/>
-              <w:right w:w="100" w:type="dxa"/>
-            </w:tcMar>
-            <w:vAlign w:val="center"/>
-          </w:tcPr>
-          <w:p>
-            <w:pPr>
-              <w:jc w:val="right"/>
-              <w:rPr>
-                <w:b/>
-                <w:bCs/>
-                <w:color w:val="333333"/>
-                <w:sz w:val="18"/>
-                <w:szCs w:val="18"/>
-              </w:rPr>
-            </w:pPr>
-            <w:r>
-              <w:rPr>
-                <w:b/>
-                <w:bCs/>
-                <w:color w:val="333333"/>
-                <w:sz w:val="18"/>
-                <w:szCs w:val="18"/>
-              </w:rPr>
-              <w:t>150 000</w:t>
-            </w:r>
-          </w:p>
-        </w:tc>
-      </w:tr>
     </w:tbl>
     <w:p>
       <w:pPr>
@@ -3709,7 +3317,6 @@
                 <w:sz w:val="18"/>
                 <w:szCs w:val="18"/>
               </w:rPr>
-              <w:lastRenderedPageBreak/>
               <w:t>TOTAL HT</w:t>
             </w:r>
           </w:p>
@@ -4077,18 +3684,14 @@
     </w:tbl>
     <w:p>
       <w:pPr>
-        <w:spacing w:before="160"/>
+        <w:rPr>
+          <w:b/>
+          <w:bCs/>
+          <w:sz w:val="2"/>
+          <w:szCs w:val="2"/>
+        </w:rPr>
       </w:pPr>
     </w:p>
-    <w:p/>
-    <w:p/>
-    <w:p/>
-    <w:p/>
-    <w:p/>
-    <w:p/>
-    <w:p/>
-    <w:p/>
-    <w:p/>
     <w:sectPr>
       <w:headerReference w:type="default" r:id="rId8"/>
       <w:footerReference w:type="default" r:id="rId9"/>

</xml_diff>